<commit_message>
feat: port shared uGFX interface to STM32 hardware
</commit_message>
<xml_diff>
--- a/docs/fa/docx/SIM5300EA-DTMF-STM32F407-report.docx
+++ b/docs/fa/docx/SIM5300EA-DTMF-STM32F407-report.docx
@@ -1516,7 +1516,9 @@
       </w:pPr>
       <w:r>
         <w:rPr>
-          <w:rFonts w:cs="LM Roman Slanted 9" w:ascii="LM Roman Slanted 9" w:hAnsi="LM Roman Slanted 9"/>
+          <w:b w:val="false"/>
+          <w:i w:val="false"/>
+          <w:sz w:val="26"/>
           <w:rtl w:val="true"/>
         </w:rPr>
       </w:r>
@@ -1536,7 +1538,9 @@
       </w:pPr>
       <w:r>
         <w:rPr>
-          <w:rFonts w:cs="LM Roman Slanted 9" w:ascii="LM Roman Slanted 9" w:hAnsi="LM Roman Slanted 9"/>
+          <w:b w:val="false"/>
+          <w:i w:val="false"/>
+          <w:sz w:val="26"/>
           <w:rtl w:val="true"/>
         </w:rPr>
       </w:r>
@@ -1556,7 +1560,9 @@
       </w:pPr>
       <w:r>
         <w:rPr>
-          <w:rFonts w:cs="LM Roman Slanted 9" w:ascii="LM Roman Slanted 9" w:hAnsi="LM Roman Slanted 9"/>
+          <w:b w:val="false"/>
+          <w:i w:val="false"/>
+          <w:sz w:val="26"/>
           <w:rtl w:val="true"/>
         </w:rPr>
       </w:r>
@@ -1576,7 +1582,9 @@
       </w:pPr>
       <w:r>
         <w:rPr>
-          <w:rFonts w:cs="LM Roman Slanted 9" w:ascii="LM Roman Slanted 9" w:hAnsi="LM Roman Slanted 9"/>
+          <w:b w:val="false"/>
+          <w:i w:val="false"/>
+          <w:sz w:val="26"/>
           <w:rtl w:val="true"/>
         </w:rPr>
       </w:r>
@@ -1596,7 +1604,9 @@
       </w:pPr>
       <w:r>
         <w:rPr>
-          <w:rFonts w:cs="LM Roman Slanted 9" w:ascii="LM Roman Slanted 9" w:hAnsi="LM Roman Slanted 9"/>
+          <w:b w:val="false"/>
+          <w:i w:val="false"/>
+          <w:sz w:val="26"/>
           <w:rtl w:val="true"/>
         </w:rPr>
       </w:r>
@@ -2093,7 +2103,9 @@
       </w:pPr>
       <w:r>
         <w:rPr>
-          <w:rFonts w:cs="LM Roman Slanted 9" w:ascii="LM Roman Slanted 9" w:hAnsi="LM Roman Slanted 9"/>
+          <w:b w:val="false"/>
+          <w:i w:val="false"/>
+          <w:sz w:val="26"/>
           <w:rtl w:val="true"/>
         </w:rPr>
       </w:r>
@@ -3129,7 +3141,9 @@
       </w:pPr>
       <w:r>
         <w:rPr>
-          <w:rFonts w:cs="LM Roman Slanted 9" w:ascii="LM Roman Slanted 9" w:hAnsi="LM Roman Slanted 9"/>
+          <w:b w:val="false"/>
+          <w:i w:val="false"/>
+          <w:sz w:val="26"/>
           <w:rtl w:val="true"/>
         </w:rPr>
       </w:r>
@@ -5613,14 +5627,431 @@
       </w:pPr>
       <w:r>
         <w:rPr>
-          <w:rFonts w:cs="LM Roman Slanted 9" w:ascii="LM Roman Slanted 9" w:hAnsi="LM Roman Slanted 9"/>
+          <w:b/>
+          <w:i w:val="false"/>
+          <w:sz w:val="32"/>
+        </w:rPr>
+      </w:r>
+    </w:p>
+    <w:p>
+      <w:pPr>
+        <w:pStyle w:val="Normal"/>
+        <w:spacing w:before="0" w:after="0"/>
+        <w:rPr>
+          <w:b/>
+          <w:i w:val="false"/>
+          <w:i w:val="false"/>
+          <w:sz w:val="32"/>
+        </w:rPr>
+      </w:pPr>
+      <w:r>
+        <w:rPr>
+          <w:b/>
+          <w:i w:val="false"/>
+          <w:sz w:val="32"/>
+        </w:rPr>
+      </w:r>
+    </w:p>
+    <w:p>
+      <w:pPr>
+        <w:pStyle w:val="Normal"/>
+        <w:spacing w:before="0" w:after="0"/>
+        <w:rPr>
+          <w:b/>
+          <w:i w:val="false"/>
+          <w:i w:val="false"/>
+          <w:sz w:val="32"/>
+        </w:rPr>
+      </w:pPr>
+      <w:r>
+        <w:rPr>
+          <w:b/>
+          <w:i w:val="false"/>
+          <w:sz w:val="32"/>
+        </w:rPr>
+      </w:r>
+    </w:p>
+    <w:p>
+      <w:pPr>
+        <w:pStyle w:val="Normal"/>
+        <w:spacing w:before="0" w:after="0"/>
+        <w:rPr>
+          <w:b/>
+          <w:i w:val="false"/>
+          <w:i w:val="false"/>
+          <w:sz w:val="32"/>
+        </w:rPr>
+      </w:pPr>
+      <w:r>
+        <w:rPr>
+          <w:b/>
+          <w:i w:val="false"/>
+          <w:sz w:val="32"/>
+        </w:rPr>
+      </w:r>
+    </w:p>
+    <w:p>
+      <w:pPr>
+        <w:pStyle w:val="Normal"/>
+        <w:spacing w:before="0" w:after="0"/>
+        <w:rPr>
+          <w:b/>
+          <w:i w:val="false"/>
+          <w:i w:val="false"/>
+          <w:sz w:val="32"/>
+        </w:rPr>
+      </w:pPr>
+      <w:r>
+        <w:rPr>
+          <w:b/>
+          <w:i w:val="false"/>
+          <w:sz w:val="32"/>
+        </w:rPr>
+      </w:r>
+    </w:p>
+    <w:p>
+      <w:pPr>
+        <w:pStyle w:val="Normal"/>
+        <w:spacing w:before="0" w:after="0"/>
+        <w:rPr>
+          <w:b/>
+          <w:i w:val="false"/>
+          <w:i w:val="false"/>
+          <w:sz w:val="32"/>
+        </w:rPr>
+      </w:pPr>
+      <w:r>
+        <w:rPr>
+          <w:b/>
+          <w:i w:val="false"/>
+          <w:sz w:val="32"/>
+        </w:rPr>
+      </w:r>
+    </w:p>
+    <w:p>
+      <w:pPr>
+        <w:pStyle w:val="Normal"/>
+        <w:spacing w:before="0" w:after="0"/>
+        <w:rPr>
+          <w:b/>
+          <w:i w:val="false"/>
+          <w:i w:val="false"/>
+          <w:sz w:val="32"/>
+        </w:rPr>
+      </w:pPr>
+      <w:r>
+        <w:rPr>
+          <w:b/>
+          <w:i w:val="false"/>
+          <w:sz w:val="32"/>
+        </w:rPr>
+      </w:r>
+    </w:p>
+    <w:p>
+      <w:pPr>
+        <w:pStyle w:val="Normal"/>
+        <w:spacing w:before="0" w:after="0"/>
+        <w:rPr>
+          <w:b/>
+          <w:i w:val="false"/>
+          <w:i w:val="false"/>
+          <w:sz w:val="32"/>
+        </w:rPr>
+      </w:pPr>
+      <w:r>
+        <w:rPr>
+          <w:b/>
+          <w:i w:val="false"/>
+          <w:sz w:val="32"/>
+        </w:rPr>
+      </w:r>
+    </w:p>
+    <w:p>
+      <w:pPr>
+        <w:pStyle w:val="Normal"/>
+        <w:spacing w:before="0" w:after="0"/>
+        <w:rPr>
+          <w:b/>
+          <w:i w:val="false"/>
+          <w:i w:val="false"/>
+          <w:sz w:val="32"/>
+        </w:rPr>
+      </w:pPr>
+      <w:r>
+        <w:rPr>
+          <w:b/>
+          <w:i w:val="false"/>
+          <w:sz w:val="32"/>
+        </w:rPr>
+      </w:r>
+    </w:p>
+    <w:p>
+      <w:pPr>
+        <w:pStyle w:val="Heading2"/>
+        <w:spacing w:before="0" w:after="0"/>
+        <w:rPr>
+          <w:b/>
+          <w:i w:val="false"/>
+          <w:i w:val="false"/>
+          <w:sz w:val="32"/>
+        </w:rPr>
+      </w:pPr>
+      <w:r>
+        <w:rPr>
+          <w:b/>
+          <w:b/>
+          <w:i w:val="false"/>
+          <w:i w:val="false"/>
+          <w:sz w:val="32"/>
+          <w:sz w:val="32"/>
+          <w:rtl w:val="true"/>
+        </w:rPr>
+        <w:t>منابع</w:t>
+      </w:r>
+    </w:p>
+    <w:p>
+      <w:pPr>
+        <w:pStyle w:val="BodyText"/>
+        <w:numPr>
+          <w:ilvl w:val="0"/>
+          <w:numId w:val="7"/>
+        </w:numPr>
+        <w:tabs>
+          <w:tab w:val="clear" w:pos="720"/>
+          <w:tab w:val="left" w:pos="0" w:leader="none"/>
+        </w:tabs>
+        <w:ind w:hanging="283" w:left="709"/>
+        <w:rPr/>
+      </w:pPr>
+      <w:r>
+        <w:rPr/>
+        <w:t>SIMCom Wireless Solutions, “SIM5300E Hardware Design,” Version 1.09.</w:t>
+        <w:br/>
+      </w:r>
+      <w:hyperlink r:id="rId2">
+        <w:r>
+          <w:rPr>
+            <w:rStyle w:val="Hyperlink"/>
+          </w:rPr>
+          <w:t>https://simcom.ee/documents/SIM5300EA/SIM5300E_Hardware_Design_V1.09.pdf</w:t>
+        </w:r>
+      </w:hyperlink>
+      <w:r>
+        <w:rPr/>
+        <w:t xml:space="preserve"> (</w:t>
+      </w:r>
+      <w:hyperlink r:id="rId3">
+        <w:r>
+          <w:rPr>
+            <w:rStyle w:val="Hyperlink"/>
+          </w:rPr>
+          <w:t>Simcom</w:t>
+        </w:r>
+      </w:hyperlink>
+      <w:r>
+        <w:rPr/>
+        <w:t>)</w:t>
+      </w:r>
+    </w:p>
+    <w:p>
+      <w:pPr>
+        <w:pStyle w:val="BodyText"/>
+        <w:numPr>
+          <w:ilvl w:val="0"/>
+          <w:numId w:val="7"/>
+        </w:numPr>
+        <w:tabs>
+          <w:tab w:val="clear" w:pos="720"/>
+          <w:tab w:val="left" w:pos="0" w:leader="none"/>
+        </w:tabs>
+        <w:ind w:hanging="283" w:left="709"/>
+        <w:rPr/>
+      </w:pPr>
+      <w:r>
+        <w:rPr/>
+        <w:t>STMicroelectronics, “STM32F405xx and STM32F407xx Datasheet.”</w:t>
+        <w:br/>
+      </w:r>
+      <w:hyperlink r:id="rId4">
+        <w:r>
+          <w:rPr>
+            <w:rStyle w:val="Hyperlink"/>
+          </w:rPr>
+          <w:t>https://www.st.com/resource/en/datasheet/stm32f407ve.pdf</w:t>
+        </w:r>
+      </w:hyperlink>
+      <w:r>
+        <w:rPr/>
+        <w:t xml:space="preserve"> (</w:t>
+      </w:r>
+      <w:hyperlink r:id="rId5">
+        <w:r>
+          <w:rPr>
+            <w:rStyle w:val="Hyperlink"/>
+          </w:rPr>
+          <w:t>STMicroelectronics</w:t>
+        </w:r>
+      </w:hyperlink>
+      <w:r>
+        <w:rPr/>
+        <w:t>)</w:t>
+      </w:r>
+    </w:p>
+    <w:p>
+      <w:pPr>
+        <w:pStyle w:val="BodyText"/>
+        <w:numPr>
+          <w:ilvl w:val="0"/>
+          <w:numId w:val="7"/>
+        </w:numPr>
+        <w:tabs>
+          <w:tab w:val="clear" w:pos="720"/>
+          <w:tab w:val="left" w:pos="0" w:leader="none"/>
+        </w:tabs>
+        <w:ind w:hanging="283" w:left="709"/>
+        <w:rPr/>
+      </w:pPr>
+      <w:r>
+        <w:rPr/>
+        <w:t>Zarlink Semiconductor, “MT8870D/MT8870D-1 Integrated DTMF Receiver Datasheet.”</w:t>
+        <w:br/>
+      </w:r>
+      <w:hyperlink r:id="rId6">
+        <w:r>
+          <w:rPr>
+            <w:rStyle w:val="Hyperlink"/>
+          </w:rPr>
+          <w:t>https://www.futurlec.com/Datasheet/Zarlink/MT8870DE.pdf</w:t>
+        </w:r>
+      </w:hyperlink>
+      <w:r>
+        <w:rPr/>
+        <w:t xml:space="preserve"> (</w:t>
+      </w:r>
+      <w:hyperlink r:id="rId7">
+        <w:r>
+          <w:rPr>
+            <w:rStyle w:val="Hyperlink"/>
+          </w:rPr>
+          <w:t>Futurlec</w:t>
+        </w:r>
+      </w:hyperlink>
+      <w:r>
+        <w:rPr/>
+        <w:t>)</w:t>
+      </w:r>
+    </w:p>
+    <w:p>
+      <w:pPr>
+        <w:pStyle w:val="BodyText"/>
+        <w:numPr>
+          <w:ilvl w:val="0"/>
+          <w:numId w:val="7"/>
+        </w:numPr>
+        <w:tabs>
+          <w:tab w:val="clear" w:pos="720"/>
+          <w:tab w:val="left" w:pos="0" w:leader="none"/>
+        </w:tabs>
+        <w:ind w:hanging="283" w:left="709"/>
+        <w:rPr/>
+      </w:pPr>
+      <w:r>
+        <w:rPr/>
+        <w:t>Analog Devices, “Using the 73M2901CE DTMF Detector.”</w:t>
+        <w:br/>
+      </w:r>
+      <w:hyperlink r:id="rId8">
+        <w:r>
+          <w:rPr>
+            <w:rStyle w:val="Hyperlink"/>
+          </w:rPr>
+          <w:t>https://www.analog.com/en/resources/app-notes/using-the-73m2901ce-dtmf-detector.html</w:t>
+        </w:r>
+      </w:hyperlink>
+      <w:r>
+        <w:rPr/>
+        <w:t xml:space="preserve"> (</w:t>
+      </w:r>
+      <w:hyperlink r:id="rId9">
+        <w:r>
+          <w:rPr>
+            <w:rStyle w:val="Hyperlink"/>
+          </w:rPr>
+          <w:t>Analog Devices</w:t>
+        </w:r>
+      </w:hyperlink>
+      <w:r>
+        <w:rPr/>
+        <w:t>)</w:t>
+      </w:r>
+    </w:p>
+    <w:p>
+      <w:pPr>
+        <w:pStyle w:val="BodyText"/>
+        <w:numPr>
+          <w:ilvl w:val="0"/>
+          <w:numId w:val="7"/>
+        </w:numPr>
+        <w:tabs>
+          <w:tab w:val="clear" w:pos="720"/>
+          <w:tab w:val="left" w:pos="0" w:leader="none"/>
+        </w:tabs>
+        <w:ind w:hanging="283" w:left="709"/>
+        <w:rPr/>
+      </w:pPr>
+      <w:r>
+        <w:rPr/>
+        <w:t>International Telecommunication Union, “Recommendation ITU-T Q.23: Technical Features of Push-Button Telephone Sets.”</w:t>
+        <w:br/>
+      </w:r>
+      <w:hyperlink r:id="rId10">
+        <w:r>
+          <w:rPr>
+            <w:rStyle w:val="Hyperlink"/>
+          </w:rPr>
+          <w:t>https://www.itu.int/rec/T-REC-Q.23-198811-I/en</w:t>
+        </w:r>
+      </w:hyperlink>
+      <w:r>
+        <w:rPr/>
+        <w:t xml:space="preserve"> (</w:t>
+      </w:r>
+      <w:hyperlink r:id="rId11">
+        <w:r>
+          <w:rPr>
+            <w:rStyle w:val="Hyperlink"/>
+          </w:rPr>
+          <w:t>itu.int</w:t>
+        </w:r>
+      </w:hyperlink>
+      <w:r>
+        <w:rPr/>
+        <w:t>)</w:t>
+      </w:r>
+    </w:p>
+    <w:p>
+      <w:pPr>
+        <w:pStyle w:val="Normal"/>
+        <w:spacing w:before="0" w:after="0"/>
+        <w:rPr>
+          <w:b/>
+          <w:i w:val="false"/>
+          <w:i w:val="false"/>
+          <w:sz w:val="32"/>
+        </w:rPr>
+      </w:pPr>
+      <w:r>
+        <w:rPr>
+          <w:b/>
+          <w:i w:val="false"/>
+          <w:sz w:val="32"/>
         </w:rPr>
       </w:r>
     </w:p>
     <w:sectPr>
-      <w:footerReference w:type="even" r:id="rId2"/>
-      <w:footerReference w:type="default" r:id="rId3"/>
-      <w:footerReference w:type="first" r:id="rId4"/>
+      <w:footerReference w:type="even" r:id="rId12"/>
+      <w:footerReference w:type="default" r:id="rId13"/>
+      <w:footerReference w:type="first" r:id="rId14"/>
       <w:type w:val="nextPage"/>
       <w:pgSz w:w="12240" w:h="15840"/>
       <w:pgMar w:left="964" w:right="964" w:gutter="0" w:header="0" w:top="964" w:footer="720" w:bottom="964"/>
@@ -5695,7 +6126,7 @@
       <w:rPr>
         <w:rtl w:val="true"/>
       </w:rPr>
-      <w:t>2</w:t>
+      <w:t>4</w:t>
     </w:r>
     <w:r>
       <w:rPr>
@@ -5752,7 +6183,7 @@
       <w:rPr>
         <w:rtl w:val="true"/>
       </w:rPr>
-      <w:t>2</w:t>
+      <w:t>4</w:t>
     </w:r>
     <w:r>
       <w:rPr>
@@ -5793,6 +6224,7 @@
         </w:tabs>
         <w:ind w:left="1080" w:hanging="360"/>
       </w:pPr>
+      <w:rPr/>
     </w:lvl>
     <w:lvl w:ilvl="2">
       <w:start w:val="1"/>
@@ -5805,6 +6237,7 @@
         </w:tabs>
         <w:ind w:left="1440" w:hanging="360"/>
       </w:pPr>
+      <w:rPr/>
     </w:lvl>
     <w:lvl w:ilvl="3">
       <w:start w:val="1"/>
@@ -5817,6 +6250,7 @@
         </w:tabs>
         <w:ind w:left="1800" w:hanging="360"/>
       </w:pPr>
+      <w:rPr/>
     </w:lvl>
     <w:lvl w:ilvl="4">
       <w:start w:val="1"/>
@@ -5829,6 +6263,7 @@
         </w:tabs>
         <w:ind w:left="2160" w:hanging="360"/>
       </w:pPr>
+      <w:rPr/>
     </w:lvl>
     <w:lvl w:ilvl="5">
       <w:start w:val="1"/>
@@ -5841,6 +6276,7 @@
         </w:tabs>
         <w:ind w:left="2520" w:hanging="360"/>
       </w:pPr>
+      <w:rPr/>
     </w:lvl>
     <w:lvl w:ilvl="6">
       <w:start w:val="1"/>
@@ -5853,6 +6289,7 @@
         </w:tabs>
         <w:ind w:left="2880" w:hanging="360"/>
       </w:pPr>
+      <w:rPr/>
     </w:lvl>
     <w:lvl w:ilvl="7">
       <w:start w:val="1"/>
@@ -5865,6 +6302,7 @@
         </w:tabs>
         <w:ind w:left="3240" w:hanging="360"/>
       </w:pPr>
+      <w:rPr/>
     </w:lvl>
     <w:lvl w:ilvl="8">
       <w:start w:val="1"/>
@@ -5877,6 +6315,7 @@
         </w:tabs>
         <w:ind w:left="3600" w:hanging="360"/>
       </w:pPr>
+      <w:rPr/>
     </w:lvl>
   </w:abstractNum>
   <w:abstractNum w:abstractNumId="2">
@@ -5906,6 +6345,7 @@
         </w:tabs>
         <w:ind w:left="1080" w:hanging="360"/>
       </w:pPr>
+      <w:rPr/>
     </w:lvl>
     <w:lvl w:ilvl="2">
       <w:start w:val="1"/>
@@ -5918,6 +6358,7 @@
         </w:tabs>
         <w:ind w:left="1440" w:hanging="360"/>
       </w:pPr>
+      <w:rPr/>
     </w:lvl>
     <w:lvl w:ilvl="3">
       <w:start w:val="1"/>
@@ -5930,6 +6371,7 @@
         </w:tabs>
         <w:ind w:left="1800" w:hanging="360"/>
       </w:pPr>
+      <w:rPr/>
     </w:lvl>
     <w:lvl w:ilvl="4">
       <w:start w:val="1"/>
@@ -5942,6 +6384,7 @@
         </w:tabs>
         <w:ind w:left="2160" w:hanging="360"/>
       </w:pPr>
+      <w:rPr/>
     </w:lvl>
     <w:lvl w:ilvl="5">
       <w:start w:val="1"/>
@@ -5954,6 +6397,7 @@
         </w:tabs>
         <w:ind w:left="2520" w:hanging="360"/>
       </w:pPr>
+      <w:rPr/>
     </w:lvl>
     <w:lvl w:ilvl="6">
       <w:start w:val="1"/>
@@ -5966,6 +6410,7 @@
         </w:tabs>
         <w:ind w:left="2880" w:hanging="360"/>
       </w:pPr>
+      <w:rPr/>
     </w:lvl>
     <w:lvl w:ilvl="7">
       <w:start w:val="1"/>
@@ -5978,6 +6423,7 @@
         </w:tabs>
         <w:ind w:left="3240" w:hanging="360"/>
       </w:pPr>
+      <w:rPr/>
     </w:lvl>
     <w:lvl w:ilvl="8">
       <w:start w:val="1"/>
@@ -5990,6 +6436,7 @@
         </w:tabs>
         <w:ind w:left="3600" w:hanging="360"/>
       </w:pPr>
+      <w:rPr/>
     </w:lvl>
   </w:abstractNum>
   <w:abstractNum w:abstractNumId="3">
@@ -6019,6 +6466,7 @@
         </w:tabs>
         <w:ind w:left="1080" w:hanging="360"/>
       </w:pPr>
+      <w:rPr/>
     </w:lvl>
     <w:lvl w:ilvl="2">
       <w:start w:val="1"/>
@@ -6031,6 +6479,7 @@
         </w:tabs>
         <w:ind w:left="1440" w:hanging="360"/>
       </w:pPr>
+      <w:rPr/>
     </w:lvl>
     <w:lvl w:ilvl="3">
       <w:start w:val="1"/>
@@ -6043,6 +6492,7 @@
         </w:tabs>
         <w:ind w:left="1800" w:hanging="360"/>
       </w:pPr>
+      <w:rPr/>
     </w:lvl>
     <w:lvl w:ilvl="4">
       <w:start w:val="1"/>
@@ -6055,6 +6505,7 @@
         </w:tabs>
         <w:ind w:left="2160" w:hanging="360"/>
       </w:pPr>
+      <w:rPr/>
     </w:lvl>
     <w:lvl w:ilvl="5">
       <w:start w:val="1"/>
@@ -6067,6 +6518,7 @@
         </w:tabs>
         <w:ind w:left="2520" w:hanging="360"/>
       </w:pPr>
+      <w:rPr/>
     </w:lvl>
     <w:lvl w:ilvl="6">
       <w:start w:val="1"/>
@@ -6079,6 +6531,7 @@
         </w:tabs>
         <w:ind w:left="2880" w:hanging="360"/>
       </w:pPr>
+      <w:rPr/>
     </w:lvl>
     <w:lvl w:ilvl="7">
       <w:start w:val="1"/>
@@ -6091,6 +6544,7 @@
         </w:tabs>
         <w:ind w:left="3240" w:hanging="360"/>
       </w:pPr>
+      <w:rPr/>
     </w:lvl>
     <w:lvl w:ilvl="8">
       <w:start w:val="1"/>
@@ -6103,6 +6557,7 @@
         </w:tabs>
         <w:ind w:left="3600" w:hanging="360"/>
       </w:pPr>
+      <w:rPr/>
     </w:lvl>
   </w:abstractNum>
   <w:abstractNum w:abstractNumId="4">
@@ -6130,6 +6585,7 @@
         </w:tabs>
         <w:ind w:left="1080" w:hanging="360"/>
       </w:pPr>
+      <w:rPr/>
     </w:lvl>
     <w:lvl w:ilvl="2">
       <w:start w:val="1"/>
@@ -6142,6 +6598,7 @@
         </w:tabs>
         <w:ind w:left="1440" w:hanging="360"/>
       </w:pPr>
+      <w:rPr/>
     </w:lvl>
     <w:lvl w:ilvl="3">
       <w:start w:val="1"/>
@@ -6154,6 +6611,7 @@
         </w:tabs>
         <w:ind w:left="1800" w:hanging="360"/>
       </w:pPr>
+      <w:rPr/>
     </w:lvl>
     <w:lvl w:ilvl="4">
       <w:start w:val="1"/>
@@ -6166,6 +6624,7 @@
         </w:tabs>
         <w:ind w:left="2160" w:hanging="360"/>
       </w:pPr>
+      <w:rPr/>
     </w:lvl>
     <w:lvl w:ilvl="5">
       <w:start w:val="1"/>
@@ -6178,6 +6637,7 @@
         </w:tabs>
         <w:ind w:left="2520" w:hanging="360"/>
       </w:pPr>
+      <w:rPr/>
     </w:lvl>
     <w:lvl w:ilvl="6">
       <w:start w:val="1"/>
@@ -6190,6 +6650,7 @@
         </w:tabs>
         <w:ind w:left="2880" w:hanging="360"/>
       </w:pPr>
+      <w:rPr/>
     </w:lvl>
     <w:lvl w:ilvl="7">
       <w:start w:val="1"/>
@@ -6202,6 +6663,7 @@
         </w:tabs>
         <w:ind w:left="3240" w:hanging="360"/>
       </w:pPr>
+      <w:rPr/>
     </w:lvl>
     <w:lvl w:ilvl="8">
       <w:start w:val="1"/>
@@ -6214,6 +6676,7 @@
         </w:tabs>
         <w:ind w:left="3600" w:hanging="360"/>
       </w:pPr>
+      <w:rPr/>
     </w:lvl>
   </w:abstractNum>
   <w:abstractNum w:abstractNumId="5">
@@ -6241,6 +6704,7 @@
         </w:tabs>
         <w:ind w:left="1080" w:hanging="360"/>
       </w:pPr>
+      <w:rPr/>
     </w:lvl>
     <w:lvl w:ilvl="2">
       <w:start w:val="1"/>
@@ -6253,6 +6717,7 @@
         </w:tabs>
         <w:ind w:left="1440" w:hanging="360"/>
       </w:pPr>
+      <w:rPr/>
     </w:lvl>
     <w:lvl w:ilvl="3">
       <w:start w:val="1"/>
@@ -6265,6 +6730,7 @@
         </w:tabs>
         <w:ind w:left="1800" w:hanging="360"/>
       </w:pPr>
+      <w:rPr/>
     </w:lvl>
     <w:lvl w:ilvl="4">
       <w:start w:val="1"/>
@@ -6277,6 +6743,7 @@
         </w:tabs>
         <w:ind w:left="2160" w:hanging="360"/>
       </w:pPr>
+      <w:rPr/>
     </w:lvl>
     <w:lvl w:ilvl="5">
       <w:start w:val="1"/>
@@ -6289,6 +6756,7 @@
         </w:tabs>
         <w:ind w:left="2520" w:hanging="360"/>
       </w:pPr>
+      <w:rPr/>
     </w:lvl>
     <w:lvl w:ilvl="6">
       <w:start w:val="1"/>
@@ -6301,6 +6769,7 @@
         </w:tabs>
         <w:ind w:left="2880" w:hanging="360"/>
       </w:pPr>
+      <w:rPr/>
     </w:lvl>
     <w:lvl w:ilvl="7">
       <w:start w:val="1"/>
@@ -6313,6 +6782,7 @@
         </w:tabs>
         <w:ind w:left="3240" w:hanging="360"/>
       </w:pPr>
+      <w:rPr/>
     </w:lvl>
     <w:lvl w:ilvl="8">
       <w:start w:val="1"/>
@@ -6325,6 +6795,7 @@
         </w:tabs>
         <w:ind w:left="3600" w:hanging="360"/>
       </w:pPr>
+      <w:rPr/>
     </w:lvl>
   </w:abstractNum>
   <w:abstractNum w:abstractNumId="6">
@@ -6352,6 +6823,7 @@
         </w:tabs>
         <w:ind w:left="1080" w:hanging="360"/>
       </w:pPr>
+      <w:rPr/>
     </w:lvl>
     <w:lvl w:ilvl="2">
       <w:start w:val="1"/>
@@ -6364,6 +6836,7 @@
         </w:tabs>
         <w:ind w:left="1440" w:hanging="360"/>
       </w:pPr>
+      <w:rPr/>
     </w:lvl>
     <w:lvl w:ilvl="3">
       <w:start w:val="1"/>
@@ -6376,6 +6849,7 @@
         </w:tabs>
         <w:ind w:left="1800" w:hanging="360"/>
       </w:pPr>
+      <w:rPr/>
     </w:lvl>
     <w:lvl w:ilvl="4">
       <w:start w:val="1"/>
@@ -6388,6 +6862,7 @@
         </w:tabs>
         <w:ind w:left="2160" w:hanging="360"/>
       </w:pPr>
+      <w:rPr/>
     </w:lvl>
     <w:lvl w:ilvl="5">
       <w:start w:val="1"/>
@@ -6400,6 +6875,7 @@
         </w:tabs>
         <w:ind w:left="2520" w:hanging="360"/>
       </w:pPr>
+      <w:rPr/>
     </w:lvl>
     <w:lvl w:ilvl="6">
       <w:start w:val="1"/>
@@ -6412,6 +6888,7 @@
         </w:tabs>
         <w:ind w:left="2880" w:hanging="360"/>
       </w:pPr>
+      <w:rPr/>
     </w:lvl>
     <w:lvl w:ilvl="7">
       <w:start w:val="1"/>
@@ -6424,6 +6901,7 @@
         </w:tabs>
         <w:ind w:left="3240" w:hanging="360"/>
       </w:pPr>
+      <w:rPr/>
     </w:lvl>
     <w:lvl w:ilvl="8">
       <w:start w:val="1"/>
@@ -6436,9 +6914,129 @@
         </w:tabs>
         <w:ind w:left="3600" w:hanging="360"/>
       </w:pPr>
+      <w:rPr/>
     </w:lvl>
   </w:abstractNum>
   <w:abstractNum w:abstractNumId="7">
+    <w:lvl w:ilvl="0">
+      <w:start w:val="1"/>
+      <w:numFmt w:val="decimal"/>
+      <w:lvlText w:val="%1."/>
+      <w:lvlJc w:val="left"/>
+      <w:pPr>
+        <w:tabs>
+          <w:tab w:val="num" w:pos="709"/>
+        </w:tabs>
+        <w:ind w:left="709" w:hanging="283"/>
+      </w:pPr>
+      <w:rPr/>
+    </w:lvl>
+    <w:lvl w:ilvl="1">
+      <w:start w:val="1"/>
+      <w:numFmt w:val="decimal"/>
+      <w:lvlText w:val="%2."/>
+      <w:lvlJc w:val="left"/>
+      <w:pPr>
+        <w:tabs>
+          <w:tab w:val="num" w:pos="1418"/>
+        </w:tabs>
+        <w:ind w:left="1418" w:hanging="283"/>
+      </w:pPr>
+      <w:rPr/>
+    </w:lvl>
+    <w:lvl w:ilvl="2">
+      <w:start w:val="1"/>
+      <w:numFmt w:val="decimal"/>
+      <w:lvlText w:val="%3."/>
+      <w:lvlJc w:val="left"/>
+      <w:pPr>
+        <w:tabs>
+          <w:tab w:val="num" w:pos="2127"/>
+        </w:tabs>
+        <w:ind w:left="2127" w:hanging="283"/>
+      </w:pPr>
+      <w:rPr/>
+    </w:lvl>
+    <w:lvl w:ilvl="3">
+      <w:start w:val="1"/>
+      <w:numFmt w:val="decimal"/>
+      <w:lvlText w:val="%4."/>
+      <w:lvlJc w:val="left"/>
+      <w:pPr>
+        <w:tabs>
+          <w:tab w:val="num" w:pos="2836"/>
+        </w:tabs>
+        <w:ind w:left="2836" w:hanging="283"/>
+      </w:pPr>
+      <w:rPr/>
+    </w:lvl>
+    <w:lvl w:ilvl="4">
+      <w:start w:val="1"/>
+      <w:numFmt w:val="decimal"/>
+      <w:lvlText w:val="%5."/>
+      <w:lvlJc w:val="left"/>
+      <w:pPr>
+        <w:tabs>
+          <w:tab w:val="num" w:pos="3545"/>
+        </w:tabs>
+        <w:ind w:left="3545" w:hanging="283"/>
+      </w:pPr>
+      <w:rPr/>
+    </w:lvl>
+    <w:lvl w:ilvl="5">
+      <w:start w:val="1"/>
+      <w:numFmt w:val="decimal"/>
+      <w:lvlText w:val="%6."/>
+      <w:lvlJc w:val="left"/>
+      <w:pPr>
+        <w:tabs>
+          <w:tab w:val="num" w:pos="4254"/>
+        </w:tabs>
+        <w:ind w:left="4254" w:hanging="283"/>
+      </w:pPr>
+      <w:rPr/>
+    </w:lvl>
+    <w:lvl w:ilvl="6">
+      <w:start w:val="1"/>
+      <w:numFmt w:val="decimal"/>
+      <w:lvlText w:val="%7."/>
+      <w:lvlJc w:val="left"/>
+      <w:pPr>
+        <w:tabs>
+          <w:tab w:val="num" w:pos="4963"/>
+        </w:tabs>
+        <w:ind w:left="4963" w:hanging="283"/>
+      </w:pPr>
+      <w:rPr/>
+    </w:lvl>
+    <w:lvl w:ilvl="7">
+      <w:start w:val="1"/>
+      <w:numFmt w:val="decimal"/>
+      <w:lvlText w:val="%8."/>
+      <w:lvlJc w:val="left"/>
+      <w:pPr>
+        <w:tabs>
+          <w:tab w:val="num" w:pos="5672"/>
+        </w:tabs>
+        <w:ind w:left="5672" w:hanging="283"/>
+      </w:pPr>
+      <w:rPr/>
+    </w:lvl>
+    <w:lvl w:ilvl="8">
+      <w:start w:val="1"/>
+      <w:numFmt w:val="decimal"/>
+      <w:lvlText w:val="%9."/>
+      <w:lvlJc w:val="left"/>
+      <w:pPr>
+        <w:tabs>
+          <w:tab w:val="num" w:pos="6381"/>
+        </w:tabs>
+        <w:ind w:left="6381" w:hanging="283"/>
+      </w:pPr>
+      <w:rPr/>
+    </w:lvl>
+  </w:abstractNum>
+  <w:abstractNum w:abstractNumId="8">
     <w:lvl w:ilvl="0">
       <w:start w:val="1"/>
       <w:numFmt w:val="none"/>
@@ -6578,6 +7176,9 @@
   <w:num w:numId="7">
     <w:abstractNumId w:val="7"/>
   </w:num>
+  <w:num w:numId="8">
+    <w:abstractNumId w:val="8"/>
+  </w:num>
 </w:numbering>
 </file>
 
@@ -6586,7 +7187,7 @@
   <w:docDefaults>
     <w:rPrDefault>
       <w:rPr>
-        <w:rFonts w:ascii="Cambria" w:hAnsi="Cambria" w:eastAsia="ＭＳ 明朝" w:cs="" w:asciiTheme="minorHAnsi" w:cstheme="minorBidi" w:eastAsiaTheme="minorEastAsia" w:hAnsiTheme="minorHAnsi"/>
+        <w:rFonts w:ascii="Cambria" w:hAnsi="Cambria" w:eastAsia="" w:cs="" w:asciiTheme="minorHAnsi" w:cstheme="minorBidi" w:eastAsiaTheme="minorEastAsia" w:hAnsiTheme="minorHAnsi"/>
         <w:sz w:val="22"/>
         <w:szCs w:val="22"/>
         <w:lang w:val="en-US" w:eastAsia="en-US" w:bidi="ar-SA"/>
@@ -6744,12 +7345,13 @@
     <w:rsid w:val="00fc693f"/>
     <w:pPr>
       <w:widowControl/>
+      <w:suppressAutoHyphens w:val="true"/>
       <w:bidi w:val="0"/>
       <w:spacing w:lineRule="auto" w:line="276" w:before="0" w:after="200"/>
       <w:jc w:val="left"/>
     </w:pPr>
     <w:rPr>
-      <w:rFonts w:ascii="Noto Naskh Arabic" w:hAnsi="Noto Naskh Arabic" w:cs="Noto Naskh Arabic" w:eastAsia="ＭＳ 明朝" w:eastAsiaTheme="minorEastAsia"/>
+      <w:rFonts w:ascii="Noto Naskh Arabic" w:hAnsi="Noto Naskh Arabic" w:eastAsia="" w:cs="Noto Naskh Arabic" w:eastAsiaTheme="minorEastAsia"/>
       <w:color w:val="auto"/>
       <w:kern w:val="0"/>
       <w:sz w:val="26"/>
@@ -6772,7 +7374,7 @@
       <w:outlineLvl w:val="0"/>
     </w:pPr>
     <w:rPr>
-      <w:rFonts w:ascii="Calibri" w:hAnsi="Calibri" w:eastAsia="ＭＳ ゴシック" w:cs="" w:asciiTheme="majorHAnsi" w:cstheme="majorBidi" w:eastAsiaTheme="majorEastAsia" w:hAnsiTheme="majorHAnsi"/>
+      <w:rFonts w:ascii="Calibri" w:hAnsi="Calibri" w:eastAsia="" w:cs="" w:asciiTheme="majorHAnsi" w:cstheme="majorBidi" w:eastAsiaTheme="majorEastAsia" w:hAnsiTheme="majorHAnsi"/>
       <w:b/>
       <w:bCs/>
       <w:color w:themeColor="accent1" w:themeShade="bf" w:val="365F91"/>
@@ -6796,7 +7398,7 @@
       <w:outlineLvl w:val="1"/>
     </w:pPr>
     <w:rPr>
-      <w:rFonts w:ascii="Calibri" w:hAnsi="Calibri" w:eastAsia="ＭＳ ゴシック" w:cs="" w:asciiTheme="majorHAnsi" w:cstheme="majorBidi" w:eastAsiaTheme="majorEastAsia" w:hAnsiTheme="majorHAnsi"/>
+      <w:rFonts w:ascii="Calibri" w:hAnsi="Calibri" w:eastAsia="" w:cs="" w:asciiTheme="majorHAnsi" w:cstheme="majorBidi" w:eastAsiaTheme="majorEastAsia" w:hAnsiTheme="majorHAnsi"/>
       <w:b/>
       <w:bCs/>
       <w:color w:themeColor="accent1" w:val="4F81BD"/>
@@ -6820,7 +7422,7 @@
       <w:outlineLvl w:val="2"/>
     </w:pPr>
     <w:rPr>
-      <w:rFonts w:ascii="Calibri" w:hAnsi="Calibri" w:eastAsia="ＭＳ ゴシック" w:cs="" w:asciiTheme="majorHAnsi" w:cstheme="majorBidi" w:eastAsiaTheme="majorEastAsia" w:hAnsiTheme="majorHAnsi"/>
+      <w:rFonts w:ascii="Calibri" w:hAnsi="Calibri" w:eastAsia="" w:cs="" w:asciiTheme="majorHAnsi" w:cstheme="majorBidi" w:eastAsiaTheme="majorEastAsia" w:hAnsiTheme="majorHAnsi"/>
       <w:b/>
       <w:bCs/>
       <w:color w:themeColor="accent1" w:val="4F81BD"/>
@@ -6843,7 +7445,7 @@
       <w:outlineLvl w:val="3"/>
     </w:pPr>
     <w:rPr>
-      <w:rFonts w:ascii="Calibri" w:hAnsi="Calibri" w:eastAsia="ＭＳ ゴシック" w:cs="" w:asciiTheme="majorHAnsi" w:cstheme="majorBidi" w:eastAsiaTheme="majorEastAsia" w:hAnsiTheme="majorHAnsi"/>
+      <w:rFonts w:ascii="Calibri" w:hAnsi="Calibri" w:eastAsia="" w:cs="" w:asciiTheme="majorHAnsi" w:cstheme="majorBidi" w:eastAsiaTheme="majorEastAsia" w:hAnsiTheme="majorHAnsi"/>
       <w:b/>
       <w:bCs/>
       <w:i/>
@@ -6868,7 +7470,7 @@
       <w:outlineLvl w:val="4"/>
     </w:pPr>
     <w:rPr>
-      <w:rFonts w:ascii="Calibri" w:hAnsi="Calibri" w:eastAsia="ＭＳ ゴシック" w:cs="" w:asciiTheme="majorHAnsi" w:cstheme="majorBidi" w:eastAsiaTheme="majorEastAsia" w:hAnsiTheme="majorHAnsi"/>
+      <w:rFonts w:ascii="Calibri" w:hAnsi="Calibri" w:eastAsia="" w:cs="" w:asciiTheme="majorHAnsi" w:cstheme="majorBidi" w:eastAsiaTheme="majorEastAsia" w:hAnsiTheme="majorHAnsi"/>
       <w:color w:themeColor="accent1" w:themeShade="7f" w:val="243F60"/>
     </w:rPr>
   </w:style>
@@ -6889,7 +7491,7 @@
       <w:outlineLvl w:val="5"/>
     </w:pPr>
     <w:rPr>
-      <w:rFonts w:ascii="Calibri" w:hAnsi="Calibri" w:eastAsia="ＭＳ ゴシック" w:cs="" w:asciiTheme="majorHAnsi" w:cstheme="majorBidi" w:eastAsiaTheme="majorEastAsia" w:hAnsiTheme="majorHAnsi"/>
+      <w:rFonts w:ascii="Calibri" w:hAnsi="Calibri" w:eastAsia="" w:cs="" w:asciiTheme="majorHAnsi" w:cstheme="majorBidi" w:eastAsiaTheme="majorEastAsia" w:hAnsiTheme="majorHAnsi"/>
       <w:i/>
       <w:iCs/>
       <w:color w:themeColor="accent1" w:themeShade="7f" w:val="243F60"/>
@@ -6912,7 +7514,7 @@
       <w:outlineLvl w:val="6"/>
     </w:pPr>
     <w:rPr>
-      <w:rFonts w:ascii="Calibri" w:hAnsi="Calibri" w:eastAsia="ＭＳ ゴシック" w:cs="" w:asciiTheme="majorHAnsi" w:cstheme="majorBidi" w:eastAsiaTheme="majorEastAsia" w:hAnsiTheme="majorHAnsi"/>
+      <w:rFonts w:ascii="Calibri" w:hAnsi="Calibri" w:eastAsia="" w:cs="" w:asciiTheme="majorHAnsi" w:cstheme="majorBidi" w:eastAsiaTheme="majorEastAsia" w:hAnsiTheme="majorHAnsi"/>
       <w:i/>
       <w:iCs/>
       <w:color w:themeColor="text1" w:themeTint="bf" w:val="404040"/>
@@ -6935,7 +7537,7 @@
       <w:outlineLvl w:val="7"/>
     </w:pPr>
     <w:rPr>
-      <w:rFonts w:ascii="Calibri" w:hAnsi="Calibri" w:eastAsia="ＭＳ ゴシック" w:cs="" w:asciiTheme="majorHAnsi" w:cstheme="majorBidi" w:eastAsiaTheme="majorEastAsia" w:hAnsiTheme="majorHAnsi"/>
+      <w:rFonts w:ascii="Calibri" w:hAnsi="Calibri" w:eastAsia="" w:cs="" w:asciiTheme="majorHAnsi" w:cstheme="majorBidi" w:eastAsiaTheme="majorEastAsia" w:hAnsiTheme="majorHAnsi"/>
       <w:color w:themeColor="accent1" w:val="4F81BD"/>
       <w:sz w:val="20"/>
       <w:szCs w:val="20"/>
@@ -6958,7 +7560,7 @@
       <w:outlineLvl w:val="8"/>
     </w:pPr>
     <w:rPr>
-      <w:rFonts w:ascii="Calibri" w:hAnsi="Calibri" w:eastAsia="ＭＳ ゴシック" w:cs="" w:asciiTheme="majorHAnsi" w:cstheme="majorBidi" w:eastAsiaTheme="majorEastAsia" w:hAnsiTheme="majorHAnsi"/>
+      <w:rFonts w:ascii="Calibri" w:hAnsi="Calibri" w:eastAsia="" w:cs="" w:asciiTheme="majorHAnsi" w:cstheme="majorBidi" w:eastAsiaTheme="majorEastAsia" w:hAnsiTheme="majorHAnsi"/>
       <w:i/>
       <w:iCs/>
       <w:color w:themeColor="text1" w:themeTint="bf" w:val="404040"/>
@@ -7000,7 +7602,7 @@
     <w:qFormat/>
     <w:rsid w:val="00fc693f"/>
     <w:rPr>
-      <w:rFonts w:ascii="Calibri" w:hAnsi="Calibri" w:eastAsia="ＭＳ ゴシック" w:cs="" w:asciiTheme="majorHAnsi" w:cstheme="majorBidi" w:eastAsiaTheme="majorEastAsia" w:hAnsiTheme="majorHAnsi"/>
+      <w:rFonts w:ascii="Calibri" w:hAnsi="Calibri" w:eastAsia="" w:cs="" w:asciiTheme="majorHAnsi" w:cstheme="majorBidi" w:eastAsiaTheme="majorEastAsia" w:hAnsiTheme="majorHAnsi"/>
       <w:b/>
       <w:bCs/>
       <w:color w:themeColor="accent1" w:themeShade="bf" w:val="365F91"/>
@@ -7016,7 +7618,7 @@
     <w:qFormat/>
     <w:rsid w:val="00fc693f"/>
     <w:rPr>
-      <w:rFonts w:ascii="Calibri" w:hAnsi="Calibri" w:eastAsia="ＭＳ ゴシック" w:cs="" w:asciiTheme="majorHAnsi" w:cstheme="majorBidi" w:eastAsiaTheme="majorEastAsia" w:hAnsiTheme="majorHAnsi"/>
+      <w:rFonts w:ascii="Calibri" w:hAnsi="Calibri" w:eastAsia="" w:cs="" w:asciiTheme="majorHAnsi" w:cstheme="majorBidi" w:eastAsiaTheme="majorEastAsia" w:hAnsiTheme="majorHAnsi"/>
       <w:b/>
       <w:bCs/>
       <w:color w:themeColor="accent1" w:val="4F81BD"/>
@@ -7032,7 +7634,7 @@
     <w:qFormat/>
     <w:rsid w:val="00fc693f"/>
     <w:rPr>
-      <w:rFonts w:ascii="Calibri" w:hAnsi="Calibri" w:eastAsia="ＭＳ ゴシック" w:cs="" w:asciiTheme="majorHAnsi" w:cstheme="majorBidi" w:eastAsiaTheme="majorEastAsia" w:hAnsiTheme="majorHAnsi"/>
+      <w:rFonts w:ascii="Calibri" w:hAnsi="Calibri" w:eastAsia="" w:cs="" w:asciiTheme="majorHAnsi" w:cstheme="majorBidi" w:eastAsiaTheme="majorEastAsia" w:hAnsiTheme="majorHAnsi"/>
       <w:b/>
       <w:bCs/>
       <w:color w:themeColor="accent1" w:val="4F81BD"/>
@@ -7046,7 +7648,7 @@
     <w:qFormat/>
     <w:rsid w:val="00fc693f"/>
     <w:rPr>
-      <w:rFonts w:ascii="Calibri" w:hAnsi="Calibri" w:eastAsia="ＭＳ ゴシック" w:cs="" w:asciiTheme="majorHAnsi" w:cstheme="majorBidi" w:eastAsiaTheme="majorEastAsia" w:hAnsiTheme="majorHAnsi"/>
+      <w:rFonts w:ascii="Calibri" w:hAnsi="Calibri" w:eastAsia="" w:cs="" w:asciiTheme="majorHAnsi" w:cstheme="majorBidi" w:eastAsiaTheme="majorEastAsia" w:hAnsiTheme="majorHAnsi"/>
       <w:color w:themeColor="text2" w:themeShade="bf" w:val="17365D"/>
       <w:spacing w:val="5"/>
       <w:kern w:val="2"/>
@@ -7062,7 +7664,7 @@
     <w:qFormat/>
     <w:rsid w:val="00fc693f"/>
     <w:rPr>
-      <w:rFonts w:ascii="Calibri" w:hAnsi="Calibri" w:eastAsia="ＭＳ ゴシック" w:cs="" w:asciiTheme="majorHAnsi" w:cstheme="majorBidi" w:eastAsiaTheme="majorEastAsia" w:hAnsiTheme="majorHAnsi"/>
+      <w:rFonts w:ascii="Calibri" w:hAnsi="Calibri" w:eastAsia="" w:cs="" w:asciiTheme="majorHAnsi" w:cstheme="majorBidi" w:eastAsiaTheme="majorEastAsia" w:hAnsiTheme="majorHAnsi"/>
       <w:i/>
       <w:iCs/>
       <w:color w:themeColor="accent1" w:val="4F81BD"/>
@@ -7135,7 +7737,7 @@
     <w:qFormat/>
     <w:rsid w:val="00fc693f"/>
     <w:rPr>
-      <w:rFonts w:ascii="Calibri" w:hAnsi="Calibri" w:eastAsia="ＭＳ ゴシック" w:cs="" w:asciiTheme="majorHAnsi" w:cstheme="majorBidi" w:eastAsiaTheme="majorEastAsia" w:hAnsiTheme="majorHAnsi"/>
+      <w:rFonts w:ascii="Calibri" w:hAnsi="Calibri" w:eastAsia="" w:cs="" w:asciiTheme="majorHAnsi" w:cstheme="majorBidi" w:eastAsiaTheme="majorEastAsia" w:hAnsiTheme="majorHAnsi"/>
       <w:b/>
       <w:bCs/>
       <w:i/>
@@ -7152,7 +7754,7 @@
     <w:qFormat/>
     <w:rsid w:val="00fc693f"/>
     <w:rPr>
-      <w:rFonts w:ascii="Calibri" w:hAnsi="Calibri" w:eastAsia="ＭＳ ゴシック" w:cs="" w:asciiTheme="majorHAnsi" w:cstheme="majorBidi" w:eastAsiaTheme="majorEastAsia" w:hAnsiTheme="majorHAnsi"/>
+      <w:rFonts w:ascii="Calibri" w:hAnsi="Calibri" w:eastAsia="" w:cs="" w:asciiTheme="majorHAnsi" w:cstheme="majorBidi" w:eastAsiaTheme="majorEastAsia" w:hAnsiTheme="majorHAnsi"/>
       <w:color w:themeColor="accent1" w:themeShade="7f" w:val="243F60"/>
     </w:rPr>
   </w:style>
@@ -7165,7 +7767,7 @@
     <w:qFormat/>
     <w:rsid w:val="00fc693f"/>
     <w:rPr>
-      <w:rFonts w:ascii="Calibri" w:hAnsi="Calibri" w:eastAsia="ＭＳ ゴシック" w:cs="" w:asciiTheme="majorHAnsi" w:cstheme="majorBidi" w:eastAsiaTheme="majorEastAsia" w:hAnsiTheme="majorHAnsi"/>
+      <w:rFonts w:ascii="Calibri" w:hAnsi="Calibri" w:eastAsia="" w:cs="" w:asciiTheme="majorHAnsi" w:cstheme="majorBidi" w:eastAsiaTheme="majorEastAsia" w:hAnsiTheme="majorHAnsi"/>
       <w:i/>
       <w:iCs/>
       <w:color w:themeColor="accent1" w:themeShade="7f" w:val="243F60"/>
@@ -7180,7 +7782,7 @@
     <w:qFormat/>
     <w:rsid w:val="00fc693f"/>
     <w:rPr>
-      <w:rFonts w:ascii="Calibri" w:hAnsi="Calibri" w:eastAsia="ＭＳ ゴシック" w:cs="" w:asciiTheme="majorHAnsi" w:cstheme="majorBidi" w:eastAsiaTheme="majorEastAsia" w:hAnsiTheme="majorHAnsi"/>
+      <w:rFonts w:ascii="Calibri" w:hAnsi="Calibri" w:eastAsia="" w:cs="" w:asciiTheme="majorHAnsi" w:cstheme="majorBidi" w:eastAsiaTheme="majorEastAsia" w:hAnsiTheme="majorHAnsi"/>
       <w:i/>
       <w:iCs/>
       <w:color w:themeColor="text1" w:themeTint="bf" w:val="404040"/>
@@ -7195,7 +7797,7 @@
     <w:qFormat/>
     <w:rsid w:val="00fc693f"/>
     <w:rPr>
-      <w:rFonts w:ascii="Calibri" w:hAnsi="Calibri" w:eastAsia="ＭＳ ゴシック" w:cs="" w:asciiTheme="majorHAnsi" w:cstheme="majorBidi" w:eastAsiaTheme="majorEastAsia" w:hAnsiTheme="majorHAnsi"/>
+      <w:rFonts w:ascii="Calibri" w:hAnsi="Calibri" w:eastAsia="" w:cs="" w:asciiTheme="majorHAnsi" w:cstheme="majorBidi" w:eastAsiaTheme="majorEastAsia" w:hAnsiTheme="majorHAnsi"/>
       <w:color w:themeColor="accent1" w:val="4F81BD"/>
       <w:sz w:val="20"/>
       <w:szCs w:val="20"/>
@@ -7210,7 +7812,7 @@
     <w:qFormat/>
     <w:rsid w:val="00fc693f"/>
     <w:rPr>
-      <w:rFonts w:ascii="Calibri" w:hAnsi="Calibri" w:eastAsia="ＭＳ ゴシック" w:cs="" w:asciiTheme="majorHAnsi" w:cstheme="majorBidi" w:eastAsiaTheme="majorEastAsia" w:hAnsiTheme="majorHAnsi"/>
+      <w:rFonts w:ascii="Calibri" w:hAnsi="Calibri" w:eastAsia="" w:cs="" w:asciiTheme="majorHAnsi" w:cstheme="majorBidi" w:eastAsiaTheme="majorEastAsia" w:hAnsiTheme="majorHAnsi"/>
       <w:i/>
       <w:iCs/>
       <w:color w:themeColor="text1" w:themeTint="bf" w:val="404040"/>
@@ -7319,6 +7921,25 @@
       <w:bCs/>
       <w:smallCaps/>
       <w:spacing w:val="5"/>
+    </w:rPr>
+  </w:style>
+  <w:style w:type="character" w:styleId="NumberingSymbols">
+    <w:name w:val="Numbering Symbols"/>
+    <w:qFormat/>
+    <w:rPr/>
+  </w:style>
+  <w:style w:type="character" w:styleId="Hyperlink">
+    <w:name w:val="Hyperlink"/>
+    <w:rPr>
+      <w:color w:val="000080"/>
+      <w:u w:val="single"/>
+    </w:rPr>
+  </w:style>
+  <w:style w:type="character" w:styleId="FollowedHyperlink">
+    <w:name w:val="FollowedHyperlink"/>
+    <w:rPr>
+      <w:color w:val="800000"/>
+      <w:u w:val="single"/>
     </w:rPr>
   </w:style>
   <w:style w:type="paragraph" w:styleId="Heading">
@@ -7440,12 +8061,13 @@
     <w:rsid w:val="00fc693f"/>
     <w:pPr>
       <w:widowControl/>
+      <w:suppressAutoHyphens w:val="true"/>
       <w:bidi w:val="0"/>
       <w:spacing w:lineRule="auto" w:line="240" w:before="0" w:after="0"/>
       <w:jc w:val="left"/>
     </w:pPr>
     <w:rPr>
-      <w:rFonts w:ascii="Cambria" w:hAnsi="Cambria" w:eastAsia="ＭＳ 明朝" w:cs="" w:asciiTheme="minorHAnsi" w:cstheme="minorBidi" w:eastAsiaTheme="minorEastAsia" w:hAnsiTheme="minorHAnsi"/>
+      <w:rFonts w:ascii="Cambria" w:hAnsi="Cambria" w:eastAsia="" w:cs="" w:asciiTheme="minorHAnsi" w:cstheme="minorBidi" w:eastAsiaTheme="minorEastAsia" w:hAnsiTheme="minorHAnsi"/>
       <w:color w:val="auto"/>
       <w:kern w:val="0"/>
       <w:sz w:val="22"/>
@@ -7469,7 +8091,7 @@
       <w:contextualSpacing/>
     </w:pPr>
     <w:rPr>
-      <w:rFonts w:ascii="Calibri" w:hAnsi="Calibri" w:eastAsia="ＭＳ ゴシック" w:cs="" w:asciiTheme="majorHAnsi" w:cstheme="majorBidi" w:eastAsiaTheme="majorEastAsia" w:hAnsiTheme="majorHAnsi"/>
+      <w:rFonts w:ascii="Calibri" w:hAnsi="Calibri" w:eastAsia="" w:cs="" w:asciiTheme="majorHAnsi" w:cstheme="majorBidi" w:eastAsiaTheme="majorEastAsia" w:hAnsiTheme="majorHAnsi"/>
       <w:color w:themeColor="text2" w:themeShade="bf" w:val="17365D"/>
       <w:spacing w:val="5"/>
       <w:kern w:val="2"/>
@@ -7487,7 +8109,7 @@
     <w:rsid w:val="00fc693f"/>
     <w:pPr/>
     <w:rPr>
-      <w:rFonts w:ascii="Calibri" w:hAnsi="Calibri" w:eastAsia="ＭＳ ゴシック" w:cs="" w:asciiTheme="majorHAnsi" w:cstheme="majorBidi" w:eastAsiaTheme="majorEastAsia" w:hAnsiTheme="majorHAnsi"/>
+      <w:rFonts w:ascii="Calibri" w:hAnsi="Calibri" w:eastAsia="" w:cs="" w:asciiTheme="majorHAnsi" w:cstheme="majorBidi" w:eastAsiaTheme="majorEastAsia" w:hAnsiTheme="majorHAnsi"/>
       <w:i/>
       <w:iCs/>
       <w:color w:themeColor="accent1" w:val="4F81BD"/>
@@ -7720,12 +8342,13 @@
         <w:tab w:val="left" w:pos="3456" w:leader="none"/>
         <w:tab w:val="left" w:pos="4032" w:leader="none"/>
       </w:tabs>
+      <w:suppressAutoHyphens w:val="true"/>
       <w:bidi w:val="0"/>
       <w:spacing w:lineRule="auto" w:line="276" w:before="0" w:after="200"/>
       <w:jc w:val="left"/>
     </w:pPr>
     <w:rPr>
-      <w:rFonts w:ascii="Courier" w:hAnsi="Courier" w:eastAsia="ＭＳ 明朝" w:cs="" w:cstheme="minorBidi" w:eastAsiaTheme="minorEastAsia"/>
+      <w:rFonts w:ascii="Courier" w:hAnsi="Courier" w:eastAsia="" w:cs="" w:cstheme="minorBidi" w:eastAsiaTheme="minorEastAsia"/>
       <w:color w:val="auto"/>
       <w:kern w:val="0"/>
       <w:sz w:val="20"/>
@@ -10946,7 +11569,6 @@
       <w:pPr>
         <w:spacing w:before="0" w:after="0" w:line="240" w:lineRule="auto"/>
       </w:pPr>
-      <w:rPr/>
       <w:tblPr/>
       <w:tcPr>
         <w:tcBorders>
@@ -11092,7 +11714,6 @@
       <w:pPr>
         <w:spacing w:before="0" w:after="0" w:line="240" w:lineRule="auto"/>
       </w:pPr>
-      <w:rPr/>
       <w:tblPr/>
       <w:tcPr>
         <w:tcBorders>
@@ -11238,7 +11859,6 @@
       <w:pPr>
         <w:spacing w:before="0" w:after="0" w:line="240" w:lineRule="auto"/>
       </w:pPr>
-      <w:rPr/>
       <w:tblPr/>
       <w:tcPr>
         <w:tcBorders>
@@ -11384,7 +12004,6 @@
       <w:pPr>
         <w:spacing w:before="0" w:after="0" w:line="240" w:lineRule="auto"/>
       </w:pPr>
-      <w:rPr/>
       <w:tblPr/>
       <w:tcPr>
         <w:tcBorders>
@@ -11530,7 +12149,6 @@
       <w:pPr>
         <w:spacing w:before="0" w:after="0" w:line="240" w:lineRule="auto"/>
       </w:pPr>
-      <w:rPr/>
       <w:tblPr/>
       <w:tcPr>
         <w:tcBorders>
@@ -11676,7 +12294,6 @@
       <w:pPr>
         <w:spacing w:before="0" w:after="0" w:line="240" w:lineRule="auto"/>
       </w:pPr>
-      <w:rPr/>
       <w:tblPr/>
       <w:tcPr>
         <w:tcBorders>
@@ -11822,7 +12439,6 @@
       <w:pPr>
         <w:spacing w:before="0" w:after="0" w:line="240" w:lineRule="auto"/>
       </w:pPr>
-      <w:rPr/>
       <w:tblPr/>
       <w:tcPr>
         <w:tcBorders>

</xml_diff>